<commit_message>
Clear Airtable cap (connections local-first) + auto-launch CDP browser + archive local ledger + resume competency swap
</commit_message>
<xml_diff>
--- a/rahil-nathani-resume-A.docx
+++ b/rahil-nathani-resume-A.docx
@@ -283,10 +283,10 @@
         <w:t xml:space="preserve">  </w:t>
       </w:r>
       <w:r>
-        <w:t xml:space="preserve">Lean </w:t>
-      </w:r>
-      <w:r>
-        <w:t>Healthcare Domain Delivery</w:t>
+        <w:t xml:space="preserve">SQL </w:t>
+      </w:r>
+      <w:r>
+        <w:t>Querying and Data Modeling</w:t>
       </w:r>
     </w:p>
     <w:p>

</xml_diff>